<commit_message>
Update invoice year from 2027 to 2026 in modell2027.docx
</commit_message>
<xml_diff>
--- a/modell2027.docx
+++ b/modell2027.docx
@@ -203,16 +203,14 @@
                       <w:rFonts w:ascii="Lucida Fax" w:hAnsi="Lucida Fax"/>
                       <w:bCs/>
                       <w:szCs w:val="16"/>
-                      <w:lang w:val="fr-FR"/>
                     </w:rPr>
                   </w:pPr>
                   <w:r>
                     <w:rPr>
-                      <w:rFonts w:ascii="Lucida Fax" w:hAnsi="Lucida Fax"/>
-                      <w:bCs/>
+                      <w:rFonts w:ascii="Lucida Fax" w:hAnsi="Lucida Fax" w:eastAsia="Times New Roman" w:cs="Arial" w:csTheme="minorBidi"/>
                       <w:color w:val="C00000"/>
+                      <w:sz w:val="16"/>
                       <w:szCs w:val="16"/>
-                      <w:lang w:val="fr-FR"/>
                     </w:rPr>
                     <w:t xml:space="preserve">Facture N° </w:t>
                   </w:r>
@@ -233,11 +231,10 @@
                     <w:sdtContent>
                       <w:r>
                         <w:rPr>
-                          <w:rFonts w:ascii="Lucida Fax" w:hAnsi="Lucida Fax"/>
-                          <w:bCs/>
+                          <w:rFonts w:ascii="Lucida Fax" w:hAnsi="Lucida Fax" w:eastAsia="Times New Roman" w:cs="Arial" w:csTheme="minorBidi"/>
                           <w:color w:val="000000" w:themeColor="text1"/>
+                          <w:sz w:val="16"/>
                           <w:szCs w:val="16"/>
-                          <w:lang w:val="fr-FR"/>
                         </w:rPr>
                         <w:t>................</w:t>
                       </w:r>
@@ -245,13 +242,12 @@
                   </w:sdt>
                   <w:r>
                     <w:rPr>
-                      <w:rFonts w:ascii="Lucida Fax" w:hAnsi="Lucida Fax"/>
-                      <w:bCs/>
+                      <w:rFonts w:ascii="Lucida Fax" w:hAnsi="Lucida Fax" w:eastAsia="Times New Roman" w:cs="Arial" w:csTheme="minorBidi"/>
                       <w:color w:val="C00000"/>
+                      <w:sz w:val="16"/>
                       <w:szCs w:val="16"/>
-                      <w:lang w:val="fr-FR"/>
                     </w:rPr>
-                    <w:t xml:space="preserve"> / 2027</w:t>
+                    <w:t xml:space="preserve"> / 2026</w:t>
                   </w:r>
                 </w:p>
                 <w:p>
@@ -2094,16 +2090,14 @@
                       <w:rFonts w:ascii="Lucida Fax" w:hAnsi="Lucida Fax"/>
                       <w:bCs/>
                       <w:szCs w:val="16"/>
-                      <w:lang w:val="fr-FR"/>
                     </w:rPr>
                   </w:pPr>
                   <w:r>
                     <w:rPr>
-                      <w:rFonts w:ascii="Lucida Fax" w:hAnsi="Lucida Fax"/>
-                      <w:bCs/>
+                      <w:rFonts w:ascii="Lucida Fax" w:hAnsi="Lucida Fax" w:eastAsia="Times New Roman" w:cs="Arial" w:csTheme="minorBidi"/>
                       <w:color w:val="C00000"/>
+                      <w:sz w:val="16"/>
                       <w:szCs w:val="16"/>
-                      <w:lang w:val="fr-FR"/>
                     </w:rPr>
                     <w:t xml:space="preserve">Facture N° </w:t>
                   </w:r>
@@ -2124,11 +2118,10 @@
                     <w:sdtContent>
                       <w:r>
                         <w:rPr>
-                          <w:rFonts w:ascii="Lucida Fax" w:hAnsi="Lucida Fax"/>
-                          <w:bCs/>
+                          <w:rFonts w:ascii="Lucida Fax" w:hAnsi="Lucida Fax" w:eastAsia="Times New Roman" w:cs="Arial" w:csTheme="minorBidi"/>
                           <w:color w:val="000000" w:themeColor="text1"/>
+                          <w:sz w:val="16"/>
                           <w:szCs w:val="16"/>
-                          <w:lang w:val="fr-FR"/>
                         </w:rPr>
                         <w:t>................</w:t>
                       </w:r>
@@ -2136,13 +2129,12 @@
                   </w:sdt>
                   <w:r>
                     <w:rPr>
-                      <w:rFonts w:ascii="Lucida Fax" w:hAnsi="Lucida Fax"/>
-                      <w:bCs/>
+                      <w:rFonts w:ascii="Lucida Fax" w:hAnsi="Lucida Fax" w:eastAsia="Times New Roman" w:cs="Arial" w:csTheme="minorBidi"/>
                       <w:color w:val="C00000"/>
+                      <w:sz w:val="16"/>
                       <w:szCs w:val="16"/>
-                      <w:lang w:val="fr-FR"/>
                     </w:rPr>
-                    <w:t xml:space="preserve"> / 2027</w:t>
+                    <w:t xml:space="preserve"> / 2026</w:t>
                   </w:r>
                 </w:p>
                 <w:p>

</xml_diff>